<commit_message>
Full Rebuild Chanukah 5785
</commit_message>
<xml_diff>
--- a/Files/06 - Yom Tov/15 - Chanukah/5785/Chanukah 5785.docx
+++ b/Files/06 - Yom Tov/15 - Chanukah/5785/Chanukah 5785.docx
@@ -210,7 +210,7 @@
           <w:rFonts w:ascii="Times New Roman" w:hAnsi="Times New Roman" w:cs="Times New Roman"/>
           <w:rtl/>
         </w:rPr>
-        <w:t>ש"ס</w:t>
+        <w:t>ש״ס</w:t>
       </w:r>
       <w:r>
         <w:rPr>
@@ -766,7 +766,7 @@
         <w:rPr>
           <w:rFonts w:ascii="Times New Roman" w:hAnsi="Times New Roman" w:cs="Times New Roman"/>
         </w:rPr>
-        <w:t>grant us</w:t>
+        <w:t xml:space="preserve">grant us </w:t>
       </w:r>
       <w:r>
         <w:rPr>

</xml_diff>